<commit_message>
Fill in affiliation on title page and cover letter
</commit_message>
<xml_diff>
--- a/paper/fro/cover_letter.docx
+++ b/paper/fro/cover_letter.docx
@@ -269,13 +269,7 @@
         <w:t xml:space="preserve"> </w:t>
       </w:r>
       <w:r>
-        <w:t xml:space="preserve">[AFFILIATION]</w:t>
-      </w:r>
-      <w:r>
-        <w:t xml:space="preserve"> </w:t>
-      </w:r>
-      <w:r>
-        <w:t xml:space="preserve">[FULL POSTAL ADDRESS]</w:t>
+        <w:t xml:space="preserve">Independent Researcher; Columbia University (Alumni)</w:t>
       </w:r>
       <w:r>
         <w:t xml:space="preserve"> </w:t>

</xml_diff>

<commit_message>
Put cover letter signature on separate lines
</commit_message>
<xml_diff>
--- a/paper/fro/cover_letter.docx
+++ b/paper/fro/cover_letter.docx
@@ -266,19 +266,19 @@
         <w:t xml:space="preserve">Raghuram Nagireddy</w:t>
       </w:r>
       <w:r>
-        <w:t xml:space="preserve"> </w:t>
+        <w:br/>
       </w:r>
       <w:r>
         <w:t xml:space="preserve">Independent Researcher; Columbia University (Alumni)</w:t>
       </w:r>
       <w:r>
-        <w:t xml:space="preserve"> </w:t>
+        <w:br/>
       </w:r>
       <w:r>
         <w:t xml:space="preserve">rrn2111@caa.columbia.edu</w:t>
       </w:r>
       <w:r>
-        <w:t xml:space="preserve"> </w:t>
+        <w:br/>
       </w:r>
       <w:r>
         <w:t xml:space="preserve">ORCID: 0009-0002-2203-3367</w:t>

</xml_diff>

<commit_message>
Note revised SSRN preprint in cover letter
</commit_message>
<xml_diff>
--- a/paper/fro/cover_letter.docx
+++ b/paper/fro/cover_letter.docx
@@ -224,7 +224,7 @@
         <w:pStyle w:val="FirstParagraph"/>
       </w:pPr>
       <w:r>
-        <w:t xml:space="preserve">The manuscript is original, has not been published elsewhere, and is not under consideration at any other journal. A preprint of the earlier version appeared on SSRN when the paper entered review at</w:t>
+        <w:t xml:space="preserve">The manuscript is original, has not been published elsewhere, and is not under consideration at any other journal. A preprint appeared on SSRN when the paper entered review at</w:t>
       </w:r>
       <w:r>
         <w:t xml:space="preserve"> </w:t>
@@ -239,7 +239,7 @@
         <w:t xml:space="preserve"> </w:t>
       </w:r>
       <w:r>
-        <w:t xml:space="preserve">(https://www.ssrn.com/abstract=7498983); I will replace it with the revised version. The manuscript file has been prepared for double-anonymized review: the code repository’s URL appears only on the title page. I have no competing interests to declare and received no funding for this research.</w:t>
+        <w:t xml:space="preserve">(https://www.ssrn.com/abstract=7498983); it has since been replaced with the revised version submitted here. The manuscript file has been prepared for double-anonymized review: the code repository’s URL appears only on the title page. I have no competing interests to declare and received no funding for this research.</w:t>
       </w:r>
     </w:p>
     <w:p>

</xml_diff>